<commit_message>
Pauta de Cabina: formato en blanco para completar
El Word y el PDF traían llena la columna Cantidad (76 celdas). Se vacía
para que quien revisa la cabina complete cantidades, vencimientos y
observaciones. El resto del formato no cambia.

Co-Authored-By: Claude Opus 5.5 <noreply@anthropic.com>
Claude-Session: https://claude.ai/code/session_0182Sw86QcQN9skTvXkkP7hJ
</commit_message>
<xml_diff>
--- a/public/formatos/Pauta_de_Cabina_Ambulancia.docx
+++ b/public/formatos/Pauta_de_Cabina_Ambulancia.docx
@@ -921,11 +921,7 @@
           <w:tcPr>
             <w:tcW w:w="1134" w:type="dxa"/>
           </w:tcPr>
-          <w:p>
-            <w:r>
-              <w:t>1</w:t>
-            </w:r>
-          </w:p>
+          <w:p/>
         </w:tc>
         <w:tc>
           <w:tcPr>
@@ -981,11 +977,7 @@
           <w:tcPr>
             <w:tcW w:w="1134" w:type="dxa"/>
           </w:tcPr>
-          <w:p>
-            <w:r>
-              <w:t>1</w:t>
-            </w:r>
-          </w:p>
+          <w:p/>
         </w:tc>
         <w:tc>
           <w:tcPr>
@@ -1038,9 +1030,6 @@
             <w:tcW w:w="1134" w:type="dxa"/>
           </w:tcPr>
           <w:p>
-            <w:r>
-              <w:t>1</w:t>
-            </w:r>
             <w:bookmarkStart w:id="0" w:name="_GoBack"/>
             <w:bookmarkEnd w:id="0"/>
           </w:p>
@@ -1087,11 +1076,7 @@
           <w:tcPr>
             <w:tcW w:w="1134" w:type="dxa"/>
           </w:tcPr>
-          <w:p>
-            <w:r>
-              <w:t>1</w:t>
-            </w:r>
-          </w:p>
+          <w:p/>
         </w:tc>
         <w:tc>
           <w:tcPr>
@@ -1135,11 +1120,7 @@
           <w:tcPr>
             <w:tcW w:w="1134" w:type="dxa"/>
           </w:tcPr>
-          <w:p>
-            <w:r>
-              <w:t>1</w:t>
-            </w:r>
-          </w:p>
+          <w:p/>
         </w:tc>
         <w:tc>
           <w:tcPr>
@@ -1183,11 +1164,7 @@
           <w:tcPr>
             <w:tcW w:w="1134" w:type="dxa"/>
           </w:tcPr>
-          <w:p>
-            <w:r>
-              <w:t>2</w:t>
-            </w:r>
-          </w:p>
+          <w:p/>
         </w:tc>
         <w:tc>
           <w:tcPr>
@@ -1231,11 +1208,7 @@
           <w:tcPr>
             <w:tcW w:w="1134" w:type="dxa"/>
           </w:tcPr>
-          <w:p>
-            <w:r>
-              <w:t>2</w:t>
-            </w:r>
-          </w:p>
+          <w:p/>
         </w:tc>
         <w:tc>
           <w:tcPr>
@@ -1279,11 +1252,7 @@
           <w:tcPr>
             <w:tcW w:w="1134" w:type="dxa"/>
           </w:tcPr>
-          <w:p>
-            <w:r>
-              <w:t>2</w:t>
-            </w:r>
-          </w:p>
+          <w:p/>
         </w:tc>
         <w:tc>
           <w:tcPr>
@@ -1327,11 +1296,7 @@
           <w:tcPr>
             <w:tcW w:w="1134" w:type="dxa"/>
           </w:tcPr>
-          <w:p>
-            <w:r>
-              <w:t>2</w:t>
-            </w:r>
-          </w:p>
+          <w:p/>
         </w:tc>
         <w:tc>
           <w:tcPr>
@@ -1383,11 +1348,7 @@
           <w:tcPr>
             <w:tcW w:w="1134" w:type="dxa"/>
           </w:tcPr>
-          <w:p>
-            <w:r>
-              <w:t>1</w:t>
-            </w:r>
-          </w:p>
+          <w:p/>
         </w:tc>
         <w:tc>
           <w:tcPr>
@@ -1439,11 +1400,7 @@
           <w:tcPr>
             <w:tcW w:w="1134" w:type="dxa"/>
           </w:tcPr>
-          <w:p>
-            <w:r>
-              <w:t>1</w:t>
-            </w:r>
-          </w:p>
+          <w:p/>
         </w:tc>
         <w:tc>
           <w:tcPr>
@@ -1501,11 +1458,7 @@
           <w:tcPr>
             <w:tcW w:w="1134" w:type="dxa"/>
           </w:tcPr>
-          <w:p>
-            <w:r>
-              <w:t>1</w:t>
-            </w:r>
-          </w:p>
+          <w:p/>
         </w:tc>
         <w:tc>
           <w:tcPr>
@@ -1563,11 +1516,7 @@
           <w:tcPr>
             <w:tcW w:w="1134" w:type="dxa"/>
           </w:tcPr>
-          <w:p>
-            <w:r>
-              <w:t>1</w:t>
-            </w:r>
-          </w:p>
+          <w:p/>
         </w:tc>
         <w:tc>
           <w:tcPr>
@@ -1621,11 +1570,7 @@
           <w:tcPr>
             <w:tcW w:w="1134" w:type="dxa"/>
           </w:tcPr>
-          <w:p>
-            <w:r>
-              <w:t>1</w:t>
-            </w:r>
-          </w:p>
+          <w:p/>
         </w:tc>
         <w:tc>
           <w:tcPr>
@@ -1679,11 +1624,7 @@
           <w:tcPr>
             <w:tcW w:w="1134" w:type="dxa"/>
           </w:tcPr>
-          <w:p>
-            <w:r>
-              <w:t>1</w:t>
-            </w:r>
-          </w:p>
+          <w:p/>
         </w:tc>
         <w:tc>
           <w:tcPr>
@@ -1737,11 +1678,7 @@
           <w:tcPr>
             <w:tcW w:w="1134" w:type="dxa"/>
           </w:tcPr>
-          <w:p>
-            <w:r>
-              <w:t>1</w:t>
-            </w:r>
-          </w:p>
+          <w:p/>
         </w:tc>
         <w:tc>
           <w:tcPr>
@@ -1781,11 +1718,7 @@
           <w:tcPr>
             <w:tcW w:w="1134" w:type="dxa"/>
           </w:tcPr>
-          <w:p>
-            <w:r>
-              <w:t>1</w:t>
-            </w:r>
-          </w:p>
+          <w:p/>
         </w:tc>
         <w:tc>
           <w:tcPr>
@@ -1830,11 +1763,7 @@
           <w:tcPr>
             <w:tcW w:w="1134" w:type="dxa"/>
           </w:tcPr>
-          <w:p>
-            <w:r>
-              <w:t>1</w:t>
-            </w:r>
-          </w:p>
+          <w:p/>
         </w:tc>
         <w:tc>
           <w:tcPr>
@@ -1879,11 +1808,7 @@
           <w:tcPr>
             <w:tcW w:w="1134" w:type="dxa"/>
           </w:tcPr>
-          <w:p>
-            <w:r>
-              <w:t>3</w:t>
-            </w:r>
-          </w:p>
+          <w:p/>
         </w:tc>
         <w:tc>
           <w:tcPr>
@@ -1928,11 +1853,7 @@
           <w:tcPr>
             <w:tcW w:w="1134" w:type="dxa"/>
           </w:tcPr>
-          <w:p>
-            <w:r>
-              <w:t>3</w:t>
-            </w:r>
-          </w:p>
+          <w:p/>
         </w:tc>
         <w:tc>
           <w:tcPr>
@@ -1980,11 +1901,7 @@
           <w:tcPr>
             <w:tcW w:w="1134" w:type="dxa"/>
           </w:tcPr>
-          <w:p>
-            <w:r>
-              <w:t>2</w:t>
-            </w:r>
-          </w:p>
+          <w:p/>
         </w:tc>
         <w:tc>
           <w:tcPr>
@@ -2032,11 +1949,7 @@
           <w:tcPr>
             <w:tcW w:w="1134" w:type="dxa"/>
           </w:tcPr>
-          <w:p>
-            <w:r>
-              <w:t>2</w:t>
-            </w:r>
-          </w:p>
+          <w:p/>
         </w:tc>
         <w:tc>
           <w:tcPr>
@@ -2076,11 +1989,7 @@
           <w:tcPr>
             <w:tcW w:w="1134" w:type="dxa"/>
           </w:tcPr>
-          <w:p>
-            <w:r>
-              <w:t>1</w:t>
-            </w:r>
-          </w:p>
+          <w:p/>
         </w:tc>
         <w:tc>
           <w:tcPr>
@@ -2120,11 +2029,7 @@
           <w:tcPr>
             <w:tcW w:w="1134" w:type="dxa"/>
           </w:tcPr>
-          <w:p>
-            <w:r>
-              <w:t>1</w:t>
-            </w:r>
-          </w:p>
+          <w:p/>
         </w:tc>
         <w:tc>
           <w:tcPr>
@@ -2164,11 +2069,7 @@
           <w:tcPr>
             <w:tcW w:w="1134" w:type="dxa"/>
           </w:tcPr>
-          <w:p>
-            <w:r>
-              <w:t>1</w:t>
-            </w:r>
-          </w:p>
+          <w:p/>
         </w:tc>
         <w:tc>
           <w:tcPr>
@@ -2208,11 +2109,7 @@
           <w:tcPr>
             <w:tcW w:w="1134" w:type="dxa"/>
           </w:tcPr>
-          <w:p>
-            <w:r>
-              <w:t>1</w:t>
-            </w:r>
-          </w:p>
+          <w:p/>
         </w:tc>
         <w:tc>
           <w:tcPr>
@@ -2252,11 +2149,7 @@
           <w:tcPr>
             <w:tcW w:w="1134" w:type="dxa"/>
           </w:tcPr>
-          <w:p>
-            <w:r>
-              <w:t>1</w:t>
-            </w:r>
-          </w:p>
+          <w:p/>
         </w:tc>
         <w:tc>
           <w:tcPr>
@@ -2296,11 +2189,7 @@
           <w:tcPr>
             <w:tcW w:w="1134" w:type="dxa"/>
           </w:tcPr>
-          <w:p>
-            <w:r>
-              <w:t>1</w:t>
-            </w:r>
-          </w:p>
+          <w:p/>
         </w:tc>
         <w:tc>
           <w:tcPr>
@@ -2352,11 +2241,7 @@
           <w:tcPr>
             <w:tcW w:w="1134" w:type="dxa"/>
           </w:tcPr>
-          <w:p>
-            <w:r>
-              <w:t>1</w:t>
-            </w:r>
-          </w:p>
+          <w:p/>
         </w:tc>
         <w:tc>
           <w:tcPr>
@@ -2396,11 +2281,7 @@
           <w:tcPr>
             <w:tcW w:w="1134" w:type="dxa"/>
           </w:tcPr>
-          <w:p>
-            <w:r>
-              <w:t>1</w:t>
-            </w:r>
-          </w:p>
+          <w:p/>
         </w:tc>
         <w:tc>
           <w:tcPr>
@@ -2440,11 +2321,7 @@
           <w:tcPr>
             <w:tcW w:w="1134" w:type="dxa"/>
           </w:tcPr>
-          <w:p>
-            <w:r>
-              <w:t>1</w:t>
-            </w:r>
-          </w:p>
+          <w:p/>
         </w:tc>
         <w:tc>
           <w:tcPr>
@@ -2484,11 +2361,7 @@
           <w:tcPr>
             <w:tcW w:w="1134" w:type="dxa"/>
           </w:tcPr>
-          <w:p>
-            <w:r>
-              <w:t>1</w:t>
-            </w:r>
-          </w:p>
+          <w:p/>
         </w:tc>
         <w:tc>
           <w:tcPr>
@@ -2533,11 +2406,7 @@
           <w:tcPr>
             <w:tcW w:w="1134" w:type="dxa"/>
           </w:tcPr>
-          <w:p>
-            <w:r>
-              <w:t>1</w:t>
-            </w:r>
-          </w:p>
+          <w:p/>
         </w:tc>
         <w:tc>
           <w:tcPr>
@@ -2577,11 +2446,7 @@
           <w:tcPr>
             <w:tcW w:w="1134" w:type="dxa"/>
           </w:tcPr>
-          <w:p>
-            <w:r>
-              <w:t>1</w:t>
-            </w:r>
-          </w:p>
+          <w:p/>
         </w:tc>
         <w:tc>
           <w:tcPr>
@@ -2623,11 +2488,7 @@
           <w:tcPr>
             <w:tcW w:w="1134" w:type="dxa"/>
           </w:tcPr>
-          <w:p>
-            <w:r>
-              <w:t>1</w:t>
-            </w:r>
-          </w:p>
+          <w:p/>
         </w:tc>
         <w:tc>
           <w:tcPr>
@@ -2677,11 +2538,7 @@
           <w:tcPr>
             <w:tcW w:w="1134" w:type="dxa"/>
           </w:tcPr>
-          <w:p>
-            <w:r>
-              <w:t>1</w:t>
-            </w:r>
-          </w:p>
+          <w:p/>
         </w:tc>
         <w:tc>
           <w:tcPr>
@@ -2720,11 +2577,7 @@
           <w:tcPr>
             <w:tcW w:w="1134" w:type="dxa"/>
           </w:tcPr>
-          <w:p>
-            <w:r>
-              <w:t>1</w:t>
-            </w:r>
-          </w:p>
+          <w:p/>
         </w:tc>
         <w:tc>
           <w:tcPr>
@@ -2766,11 +2619,7 @@
           <w:tcPr>
             <w:tcW w:w="1134" w:type="dxa"/>
           </w:tcPr>
-          <w:p>
-            <w:r>
-              <w:t>2</w:t>
-            </w:r>
-          </w:p>
+          <w:p/>
         </w:tc>
         <w:tc>
           <w:tcPr>
@@ -2814,11 +2663,7 @@
           <w:tcPr>
             <w:tcW w:w="1134" w:type="dxa"/>
           </w:tcPr>
-          <w:p>
-            <w:r>
-              <w:t>2</w:t>
-            </w:r>
-          </w:p>
+          <w:p/>
         </w:tc>
         <w:tc>
           <w:tcPr>
@@ -2865,11 +2710,7 @@
           <w:tcPr>
             <w:tcW w:w="1134" w:type="dxa"/>
           </w:tcPr>
-          <w:p>
-            <w:r>
-              <w:t>1</w:t>
-            </w:r>
-          </w:p>
+          <w:p/>
         </w:tc>
         <w:tc>
           <w:tcPr>
@@ -2911,11 +2752,7 @@
           <w:tcPr>
             <w:tcW w:w="1134" w:type="dxa"/>
           </w:tcPr>
-          <w:p>
-            <w:r>
-              <w:t>1</w:t>
-            </w:r>
-          </w:p>
+          <w:p/>
         </w:tc>
         <w:tc>
           <w:tcPr>
@@ -2962,11 +2799,7 @@
           <w:tcPr>
             <w:tcW w:w="1134" w:type="dxa"/>
           </w:tcPr>
-          <w:p>
-            <w:r>
-              <w:t>1</w:t>
-            </w:r>
-          </w:p>
+          <w:p/>
         </w:tc>
         <w:tc>
           <w:tcPr>
@@ -3005,11 +2838,7 @@
           <w:tcPr>
             <w:tcW w:w="1134" w:type="dxa"/>
           </w:tcPr>
-          <w:p>
-            <w:r>
-              <w:t>6</w:t>
-            </w:r>
-          </w:p>
+          <w:p/>
         </w:tc>
         <w:tc>
           <w:tcPr>
@@ -3064,11 +2893,7 @@
           <w:tcPr>
             <w:tcW w:w="1134" w:type="dxa"/>
           </w:tcPr>
-          <w:p>
-            <w:r>
-              <w:t>10</w:t>
-            </w:r>
-          </w:p>
+          <w:p/>
         </w:tc>
         <w:tc>
           <w:tcPr>
@@ -3114,11 +2939,7 @@
           <w:tcPr>
             <w:tcW w:w="1134" w:type="dxa"/>
           </w:tcPr>
-          <w:p>
-            <w:r>
-              <w:t>10</w:t>
-            </w:r>
-          </w:p>
+          <w:p/>
         </w:tc>
         <w:tc>
           <w:tcPr>
@@ -3164,11 +2985,7 @@
           <w:tcPr>
             <w:tcW w:w="1134" w:type="dxa"/>
           </w:tcPr>
-          <w:p>
-            <w:r>
-              <w:t>10</w:t>
-            </w:r>
-          </w:p>
+          <w:p/>
         </w:tc>
         <w:tc>
           <w:tcPr>
@@ -3214,11 +3031,7 @@
           <w:tcPr>
             <w:tcW w:w="1134" w:type="dxa"/>
           </w:tcPr>
-          <w:p>
-            <w:r>
-              <w:t>5</w:t>
-            </w:r>
-          </w:p>
+          <w:p/>
         </w:tc>
         <w:tc>
           <w:tcPr>
@@ -3267,11 +3080,7 @@
           <w:tcPr>
             <w:tcW w:w="1134" w:type="dxa"/>
           </w:tcPr>
-          <w:p>
-            <w:r>
-              <w:t>2</w:t>
-            </w:r>
-          </w:p>
+          <w:p/>
         </w:tc>
         <w:tc>
           <w:tcPr>
@@ -3326,11 +3135,7 @@
           <w:tcPr>
             <w:tcW w:w="1134" w:type="dxa"/>
           </w:tcPr>
-          <w:p>
-            <w:r>
-              <w:t>2</w:t>
-            </w:r>
-          </w:p>
+          <w:p/>
         </w:tc>
         <w:tc>
           <w:tcPr>
@@ -3376,11 +3181,7 @@
           <w:tcPr>
             <w:tcW w:w="1134" w:type="dxa"/>
           </w:tcPr>
-          <w:p>
-            <w:r>
-              <w:t>1</w:t>
-            </w:r>
-          </w:p>
+          <w:p/>
         </w:tc>
         <w:tc>
           <w:tcPr>
@@ -3434,11 +3235,7 @@
           <w:tcPr>
             <w:tcW w:w="1134" w:type="dxa"/>
           </w:tcPr>
-          <w:p>
-            <w:r>
-              <w:t>1</w:t>
-            </w:r>
-          </w:p>
+          <w:p/>
         </w:tc>
         <w:tc>
           <w:tcPr>
@@ -3492,11 +3289,7 @@
           <w:tcPr>
             <w:tcW w:w="1134" w:type="dxa"/>
           </w:tcPr>
-          <w:p>
-            <w:r>
-              <w:t>2</w:t>
-            </w:r>
-          </w:p>
+          <w:p/>
         </w:tc>
         <w:tc>
           <w:tcPr>
@@ -3542,11 +3335,7 @@
           <w:tcPr>
             <w:tcW w:w="1134" w:type="dxa"/>
           </w:tcPr>
-          <w:p>
-            <w:r>
-              <w:t>1</w:t>
-            </w:r>
-          </w:p>
+          <w:p/>
         </w:tc>
         <w:tc>
           <w:tcPr>
@@ -3598,11 +3387,7 @@
           <w:tcPr>
             <w:tcW w:w="1134" w:type="dxa"/>
           </w:tcPr>
-          <w:p>
-            <w:r>
-              <w:t>3</w:t>
-            </w:r>
-          </w:p>
+          <w:p/>
         </w:tc>
         <w:tc>
           <w:tcPr>
@@ -3648,11 +3433,7 @@
           <w:tcPr>
             <w:tcW w:w="1134" w:type="dxa"/>
           </w:tcPr>
-          <w:p>
-            <w:r>
-              <w:t>3</w:t>
-            </w:r>
-          </w:p>
+          <w:p/>
         </w:tc>
         <w:tc>
           <w:tcPr>
@@ -3698,11 +3479,7 @@
           <w:tcPr>
             <w:tcW w:w="1134" w:type="dxa"/>
           </w:tcPr>
-          <w:p>
-            <w:r>
-              <w:t>3</w:t>
-            </w:r>
-          </w:p>
+          <w:p/>
         </w:tc>
         <w:tc>
           <w:tcPr>
@@ -3748,11 +3525,7 @@
           <w:tcPr>
             <w:tcW w:w="1134" w:type="dxa"/>
           </w:tcPr>
-          <w:p>
-            <w:r>
-              <w:t>3</w:t>
-            </w:r>
-          </w:p>
+          <w:p/>
         </w:tc>
         <w:tc>
           <w:tcPr>
@@ -3798,11 +3571,7 @@
           <w:tcPr>
             <w:tcW w:w="1134" w:type="dxa"/>
           </w:tcPr>
-          <w:p>
-            <w:r>
-              <w:t>3</w:t>
-            </w:r>
-          </w:p>
+          <w:p/>
         </w:tc>
         <w:tc>
           <w:tcPr>
@@ -3848,11 +3617,7 @@
           <w:tcPr>
             <w:tcW w:w="1134" w:type="dxa"/>
           </w:tcPr>
-          <w:p>
-            <w:r>
-              <w:t>3</w:t>
-            </w:r>
-          </w:p>
+          <w:p/>
         </w:tc>
         <w:tc>
           <w:tcPr>
@@ -3898,11 +3663,7 @@
           <w:tcPr>
             <w:tcW w:w="1134" w:type="dxa"/>
           </w:tcPr>
-          <w:p>
-            <w:r>
-              <w:t>3</w:t>
-            </w:r>
-          </w:p>
+          <w:p/>
         </w:tc>
         <w:tc>
           <w:tcPr>
@@ -3948,11 +3709,7 @@
           <w:tcPr>
             <w:tcW w:w="1134" w:type="dxa"/>
           </w:tcPr>
-          <w:p>
-            <w:r>
-              <w:t>3</w:t>
-            </w:r>
-          </w:p>
+          <w:p/>
         </w:tc>
         <w:tc>
           <w:tcPr>
@@ -3998,11 +3755,7 @@
           <w:tcPr>
             <w:tcW w:w="1134" w:type="dxa"/>
           </w:tcPr>
-          <w:p>
-            <w:r>
-              <w:t>3</w:t>
-            </w:r>
-          </w:p>
+          <w:p/>
         </w:tc>
         <w:tc>
           <w:tcPr>
@@ -4048,11 +3801,7 @@
           <w:tcPr>
             <w:tcW w:w="1134" w:type="dxa"/>
           </w:tcPr>
-          <w:p>
-            <w:r>
-              <w:t>3</w:t>
-            </w:r>
-          </w:p>
+          <w:p/>
         </w:tc>
         <w:tc>
           <w:tcPr>
@@ -4103,11 +3852,7 @@
           <w:tcPr>
             <w:tcW w:w="1134" w:type="dxa"/>
           </w:tcPr>
-          <w:p>
-            <w:r>
-              <w:t>3</w:t>
-            </w:r>
-          </w:p>
+          <w:p/>
         </w:tc>
         <w:tc>
           <w:tcPr>
@@ -4158,11 +3903,7 @@
           <w:tcPr>
             <w:tcW w:w="1134" w:type="dxa"/>
           </w:tcPr>
-          <w:p>
-            <w:r>
-              <w:t>3</w:t>
-            </w:r>
-          </w:p>
+          <w:p/>
         </w:tc>
         <w:tc>
           <w:tcPr>
@@ -4208,11 +3949,7 @@
           <w:tcPr>
             <w:tcW w:w="1134" w:type="dxa"/>
           </w:tcPr>
-          <w:p>
-            <w:r>
-              <w:t>3</w:t>
-            </w:r>
-          </w:p>
+          <w:p/>
         </w:tc>
         <w:tc>
           <w:tcPr>
@@ -4258,11 +3995,7 @@
           <w:tcPr>
             <w:tcW w:w="1134" w:type="dxa"/>
           </w:tcPr>
-          <w:p>
-            <w:r>
-              <w:t>3</w:t>
-            </w:r>
-          </w:p>
+          <w:p/>
         </w:tc>
         <w:tc>
           <w:tcPr>
@@ -4308,11 +4041,7 @@
           <w:tcPr>
             <w:tcW w:w="1134" w:type="dxa"/>
           </w:tcPr>
-          <w:p>
-            <w:r>
-              <w:t>3</w:t>
-            </w:r>
-          </w:p>
+          <w:p/>
         </w:tc>
         <w:tc>
           <w:tcPr>
@@ -4358,11 +4087,7 @@
           <w:tcPr>
             <w:tcW w:w="1134" w:type="dxa"/>
           </w:tcPr>
-          <w:p>
-            <w:r>
-              <w:t>3</w:t>
-            </w:r>
-          </w:p>
+          <w:p/>
         </w:tc>
         <w:tc>
           <w:tcPr>
@@ -4408,11 +4133,7 @@
           <w:tcPr>
             <w:tcW w:w="1134" w:type="dxa"/>
           </w:tcPr>
-          <w:p>
-            <w:r>
-              <w:t>3</w:t>
-            </w:r>
-          </w:p>
+          <w:p/>
         </w:tc>
         <w:tc>
           <w:tcPr>
@@ -4458,11 +4179,7 @@
           <w:tcPr>
             <w:tcW w:w="1134" w:type="dxa"/>
           </w:tcPr>
-          <w:p>
-            <w:r>
-              <w:t>5</w:t>
-            </w:r>
-          </w:p>
+          <w:p/>
         </w:tc>
         <w:tc>
           <w:tcPr>
@@ -4516,11 +4233,7 @@
           <w:tcPr>
             <w:tcW w:w="1134" w:type="dxa"/>
           </w:tcPr>
-          <w:p>
-            <w:r>
-              <w:t>10</w:t>
-            </w:r>
-          </w:p>
+          <w:p/>
         </w:tc>
         <w:tc>
           <w:tcPr>
@@ -4571,11 +4284,7 @@
           <w:tcPr>
             <w:tcW w:w="1134" w:type="dxa"/>
           </w:tcPr>
-          <w:p>
-            <w:r>
-              <w:t>1</w:t>
-            </w:r>
-          </w:p>
+          <w:p/>
         </w:tc>
         <w:tc>
           <w:tcPr>
@@ -4621,11 +4330,7 @@
           <w:tcPr>
             <w:tcW w:w="1134" w:type="dxa"/>
           </w:tcPr>
-          <w:p>
-            <w:r>
-              <w:t>1</w:t>
-            </w:r>
-          </w:p>
+          <w:p/>
         </w:tc>
         <w:tc>
           <w:tcPr>
@@ -4671,11 +4376,7 @@
           <w:tcPr>
             <w:tcW w:w="1134" w:type="dxa"/>
           </w:tcPr>
-          <w:p>
-            <w:r>
-              <w:t>1</w:t>
-            </w:r>
-          </w:p>
+          <w:p/>
         </w:tc>
         <w:tc>
           <w:tcPr>
@@ -4721,11 +4422,7 @@
           <w:tcPr>
             <w:tcW w:w="1134" w:type="dxa"/>
           </w:tcPr>
-          <w:p>
-            <w:r>
-              <w:t>1</w:t>
-            </w:r>
-          </w:p>
+          <w:p/>
         </w:tc>
         <w:tc>
           <w:tcPr>

</xml_diff>